<commit_message>
Update notes, syllabus, and add Unit-I programs and Unit-II content
Co-Authored-By: Oz <oz-agent@warp.dev>
</commit_message>
<xml_diff>
--- a/Syllabus/BCA2004T_Java_Lecture_Plan_45_LecturePlan.docx
+++ b/Syllabus/BCA2004T_Java_Lecture_Plan_45_LecturePlan.docx
@@ -444,7 +444,7 @@
                 <w:rFonts w:ascii="Times New Roman" w:hAnsi="Times New Roman" w:cs="Times New Roman"/>
                 <w:color w:val="000000" w:themeColor="text1"/>
               </w:rPr>
-              <w:t>T1(1–4)</w:t>
+              <w:t>T1</w:t>
             </w:r>
           </w:p>
         </w:tc>
@@ -586,7 +586,7 @@
                 <w:rFonts w:ascii="Times New Roman" w:hAnsi="Times New Roman" w:cs="Times New Roman"/>
                 <w:color w:val="000000" w:themeColor="text1"/>
               </w:rPr>
-              <w:t>T1(5–7)</w:t>
+              <w:t>T1</w:t>
             </w:r>
           </w:p>
         </w:tc>
@@ -728,7 +728,7 @@
                 <w:rFonts w:ascii="Times New Roman" w:hAnsi="Times New Roman" w:cs="Times New Roman"/>
                 <w:color w:val="000000" w:themeColor="text1"/>
               </w:rPr>
-              <w:t>T1(8–11)</w:t>
+              <w:t>T1</w:t>
             </w:r>
           </w:p>
         </w:tc>
@@ -870,7 +870,7 @@
                 <w:rFonts w:ascii="Times New Roman" w:hAnsi="Times New Roman" w:cs="Times New Roman"/>
                 <w:color w:val="000000" w:themeColor="text1"/>
               </w:rPr>
-              <w:t>T1(12–14)</w:t>
+              <w:t>T1(</w:t>
             </w:r>
           </w:p>
         </w:tc>
@@ -1012,7 +1012,7 @@
                 <w:rFonts w:ascii="Times New Roman" w:hAnsi="Times New Roman" w:cs="Times New Roman"/>
                 <w:color w:val="000000" w:themeColor="text1"/>
               </w:rPr>
-              <w:t>T1(15–18)</w:t>
+              <w:t>T1</w:t>
             </w:r>
           </w:p>
         </w:tc>
@@ -1154,7 +1154,7 @@
                 <w:rFonts w:ascii="Times New Roman" w:hAnsi="Times New Roman" w:cs="Times New Roman"/>
                 <w:color w:val="000000" w:themeColor="text1"/>
               </w:rPr>
-              <w:t>T1(19–22)</w:t>
+              <w:t>T1</w:t>
             </w:r>
           </w:p>
         </w:tc>
@@ -1296,7 +1296,7 @@
                 <w:rFonts w:ascii="Times New Roman" w:hAnsi="Times New Roman" w:cs="Times New Roman"/>
                 <w:color w:val="000000" w:themeColor="text1"/>
               </w:rPr>
-              <w:t>T1(23–27)</w:t>
+              <w:t>T1</w:t>
             </w:r>
           </w:p>
         </w:tc>
@@ -1438,7 +1438,7 @@
                 <w:rFonts w:ascii="Times New Roman" w:hAnsi="Times New Roman" w:cs="Times New Roman"/>
                 <w:color w:val="000000" w:themeColor="text1"/>
               </w:rPr>
-              <w:t>T1(28–32)</w:t>
+              <w:t>T1</w:t>
             </w:r>
           </w:p>
         </w:tc>
@@ -1589,7 +1589,7 @@
                 <w:rFonts w:ascii="Times New Roman" w:hAnsi="Times New Roman" w:cs="Times New Roman"/>
                 <w:color w:val="000000" w:themeColor="text1"/>
               </w:rPr>
-              <w:t>T1(33–36)</w:t>
+              <w:t>T1</w:t>
             </w:r>
           </w:p>
         </w:tc>
@@ -1731,7 +1731,7 @@
                 <w:rFonts w:ascii="Times New Roman" w:hAnsi="Times New Roman" w:cs="Times New Roman"/>
                 <w:color w:val="000000" w:themeColor="text1"/>
               </w:rPr>
-              <w:t>T1(37–40)</w:t>
+              <w:t>T1</w:t>
             </w:r>
           </w:p>
         </w:tc>
@@ -2015,7 +2015,7 @@
                 <w:rFonts w:ascii="Times New Roman" w:hAnsi="Times New Roman" w:cs="Times New Roman"/>
                 <w:color w:val="000000" w:themeColor="text1"/>
               </w:rPr>
-              <w:t>T1(41–44)</w:t>
+              <w:t>T1</w:t>
             </w:r>
           </w:p>
         </w:tc>
@@ -2157,7 +2157,7 @@
                 <w:rFonts w:ascii="Times New Roman" w:hAnsi="Times New Roman" w:cs="Times New Roman"/>
                 <w:color w:val="000000" w:themeColor="text1"/>
               </w:rPr>
-              <w:t>T1(45–48)</w:t>
+              <w:t>T1</w:t>
             </w:r>
           </w:p>
         </w:tc>
@@ -2299,7 +2299,7 @@
                 <w:rFonts w:ascii="Times New Roman" w:hAnsi="Times New Roman" w:cs="Times New Roman"/>
                 <w:color w:val="000000" w:themeColor="text1"/>
               </w:rPr>
-              <w:t>T1(49–52)</w:t>
+              <w:t>T1</w:t>
             </w:r>
           </w:p>
         </w:tc>
@@ -2441,7 +2441,7 @@
                 <w:rFonts w:ascii="Times New Roman" w:hAnsi="Times New Roman" w:cs="Times New Roman"/>
                 <w:color w:val="000000" w:themeColor="text1"/>
               </w:rPr>
-              <w:t>T1(53–56)</w:t>
+              <w:t>T1</w:t>
             </w:r>
           </w:p>
         </w:tc>
@@ -2583,7 +2583,21 @@
                 <w:rFonts w:ascii="Times New Roman" w:hAnsi="Times New Roman" w:cs="Times New Roman"/>
                 <w:color w:val="000000" w:themeColor="text1"/>
               </w:rPr>
-              <w:t>T1(57–60)</w:t>
+              <w:t>T1(57–6</w:t>
+            </w:r>
+            <w:r>
+              <w:rPr>
+                <w:rFonts w:ascii="Times New Roman" w:hAnsi="Times New Roman" w:cs="Times New Roman"/>
+                <w:color w:val="000000" w:themeColor="text1"/>
+              </w:rPr>
+              <w:t>4</w:t>
+            </w:r>
+            <w:r>
+              <w:rPr>
+                <w:rFonts w:ascii="Times New Roman" w:hAnsi="Times New Roman" w:cs="Times New Roman"/>
+                <w:color w:val="000000" w:themeColor="text1"/>
+              </w:rPr>
+              <w:t>)</w:t>
             </w:r>
           </w:p>
         </w:tc>
@@ -2725,7 +2739,7 @@
                 <w:rFonts w:ascii="Times New Roman" w:hAnsi="Times New Roman" w:cs="Times New Roman"/>
                 <w:color w:val="000000" w:themeColor="text1"/>
               </w:rPr>
-              <w:t>T1(61–64)</w:t>
+              <w:t>T1</w:t>
             </w:r>
           </w:p>
         </w:tc>
@@ -2867,7 +2881,7 @@
                 <w:rFonts w:ascii="Times New Roman" w:hAnsi="Times New Roman" w:cs="Times New Roman"/>
                 <w:color w:val="000000" w:themeColor="text1"/>
               </w:rPr>
-              <w:t>T1(65–68)</w:t>
+              <w:t>T1</w:t>
             </w:r>
           </w:p>
         </w:tc>
@@ -3010,7 +3024,7 @@
                 <w:rFonts w:ascii="Times New Roman" w:hAnsi="Times New Roman" w:cs="Times New Roman"/>
                 <w:color w:val="000000" w:themeColor="text1"/>
               </w:rPr>
-              <w:t>T1(69–72)</w:t>
+              <w:t>T1</w:t>
             </w:r>
           </w:p>
         </w:tc>
@@ -3152,7 +3166,14 @@
                 <w:rFonts w:ascii="Times New Roman" w:hAnsi="Times New Roman" w:cs="Times New Roman"/>
                 <w:color w:val="000000" w:themeColor="text1"/>
               </w:rPr>
-              <w:t>T1(73–76)</w:t>
+              <w:t>T</w:t>
+            </w:r>
+            <w:r>
+              <w:rPr>
+                <w:rFonts w:ascii="Times New Roman" w:hAnsi="Times New Roman" w:cs="Times New Roman"/>
+                <w:color w:val="000000" w:themeColor="text1"/>
+              </w:rPr>
+              <w:t>1</w:t>
             </w:r>
           </w:p>
         </w:tc>
@@ -3310,7 +3331,7 @@
                 <w:rFonts w:ascii="Times New Roman" w:hAnsi="Times New Roman" w:cs="Times New Roman"/>
                 <w:color w:val="000000" w:themeColor="text1"/>
               </w:rPr>
-              <w:t>T1(77–81)</w:t>
+              <w:t>T1</w:t>
             </w:r>
           </w:p>
         </w:tc>
@@ -3594,7 +3615,7 @@
                 <w:rFonts w:ascii="Times New Roman" w:hAnsi="Times New Roman" w:cs="Times New Roman"/>
                 <w:color w:val="000000" w:themeColor="text1"/>
               </w:rPr>
-              <w:t>T1(82–86)</w:t>
+              <w:t>T1</w:t>
             </w:r>
           </w:p>
         </w:tc>
@@ -3736,7 +3757,7 @@
                 <w:rFonts w:ascii="Times New Roman" w:hAnsi="Times New Roman" w:cs="Times New Roman"/>
                 <w:color w:val="000000" w:themeColor="text1"/>
               </w:rPr>
-              <w:t>T1(87–90)</w:t>
+              <w:t>T1</w:t>
             </w:r>
           </w:p>
         </w:tc>
@@ -3878,7 +3899,7 @@
                 <w:rFonts w:ascii="Times New Roman" w:hAnsi="Times New Roman" w:cs="Times New Roman"/>
                 <w:color w:val="000000" w:themeColor="text1"/>
               </w:rPr>
-              <w:t>T1(91–94)</w:t>
+              <w:t>T1</w:t>
             </w:r>
           </w:p>
         </w:tc>
@@ -4020,7 +4041,7 @@
                 <w:rFonts w:ascii="Times New Roman" w:hAnsi="Times New Roman" w:cs="Times New Roman"/>
                 <w:color w:val="000000" w:themeColor="text1"/>
               </w:rPr>
-              <w:t>T1(95–98)</w:t>
+              <w:t>T1</w:t>
             </w:r>
           </w:p>
         </w:tc>

</xml_diff>